<commit_message>
Fix UI crash, merge transfer registration into transfer profile, fix doc templates
</commit_message>
<xml_diff>
--- a/public/2. Nghị quyết Đoàn Trường (02 bản).docx
+++ b/public/2. Nghị quyết Đoàn Trường (02 bản).docx
@@ -475,13 +475,8 @@
           <w:color w:val="000000"/>
         </w:rPr>
       </w:pPr>
-      <w:bookmarkStart w:id="0" w:name="_Hlk228265010"/>
-      <w:r>
-        <w:rPr>
-          <w:b/>
-          <w:color w:val="000000"/>
-        </w:rPr>
-        <w:t>1. Ưu điểm:</w:t>
+      <w:r>
+        <w:t>1. Ưu điểm: {{uu_diem}}</w:t>
       </w:r>
     </w:p>
     <w:p>
@@ -490,192 +485,12 @@
         <w:ind w:firstLine="567"/>
         <w:jc w:val="both"/>
         <w:rPr>
-          <w:color w:val="000000"/>
-        </w:rPr>
-      </w:pPr>
-      <w:r>
-        <w:rPr>
-          <w:color w:val="000000"/>
-        </w:rPr>
-        <w:t>-</w:t>
-      </w:r>
-      <w:r>
-        <w:rPr>
-          <w:color w:val="000000"/>
-        </w:rPr>
-        <w:t xml:space="preserve"> </w:t>
-      </w:r>
-      <w:r>
-        <w:rPr>
-          <w:color w:val="000000"/>
-        </w:rPr>
-        <w:t>Có phẩm chất chính trị tốt</w:t>
-      </w:r>
-      <w:r>
-        <w:rPr>
-          <w:color w:val="000000"/>
-        </w:rPr>
-        <w:t xml:space="preserve"> </w:t>
-      </w:r>
-      <w:r>
-        <w:rPr>
-          <w:color w:val="000000"/>
-        </w:rPr>
-        <w:t>l</w:t>
-      </w:r>
-      <w:r>
-        <w:rPr>
-          <w:color w:val="000000"/>
-        </w:rPr>
-        <w:t>ập trường tư tưởng vững vàng, tuyệt đối trung thành với đường lối của Đảng, tác phong đứng đắn, mẫu mực.</w:t>
-      </w:r>
-    </w:p>
-    <w:p>
-      <w:pPr>
-        <w:spacing w:after="120" w:line="312" w:lineRule="auto"/>
-        <w:ind w:firstLine="567"/>
-        <w:jc w:val="both"/>
-        <w:rPr>
-          <w:color w:val="000000"/>
-        </w:rPr>
-      </w:pPr>
-      <w:r>
-        <w:rPr>
-          <w:color w:val="000000"/>
-        </w:rPr>
-        <w:t>-</w:t>
-      </w:r>
-      <w:r>
-        <w:rPr>
-          <w:color w:val="000000"/>
-        </w:rPr>
-        <w:t xml:space="preserve">  </w:t>
-      </w:r>
-      <w:r>
-        <w:rPr>
-          <w:color w:val="000000"/>
-        </w:rPr>
-        <w:t xml:space="preserve">Có </w:t>
-      </w:r>
-      <w:r>
-        <w:rPr>
-          <w:color w:val="000000"/>
-        </w:rPr>
-        <w:t>lối sống đạo đức trong sáng, giản dị, luôn có ý thức tu dưỡng và rèn luyện đạo đức, luôn là tấm gương sáng cho các thế hệ noi theo.</w:t>
-      </w:r>
-    </w:p>
-    <w:p>
-      <w:pPr>
-        <w:spacing w:after="120" w:line="312" w:lineRule="auto"/>
-        <w:ind w:firstLine="567"/>
-        <w:jc w:val="both"/>
-        <w:rPr>
-          <w:color w:val="000000"/>
-        </w:rPr>
-      </w:pPr>
-      <w:r>
-        <w:rPr>
-          <w:color w:val="000000"/>
-        </w:rPr>
-        <w:t>-</w:t>
-      </w:r>
-      <w:r>
-        <w:rPr>
-          <w:color w:val="000000"/>
-        </w:rPr>
-        <w:t xml:space="preserve"> Có năng lực công tác tốt, luôn tích cực tham gia các hoạt động của chi Đoàn, khoa, Đoàn trường.</w:t>
-      </w:r>
-    </w:p>
-    <w:p>
-      <w:pPr>
-        <w:spacing w:after="120" w:line="312" w:lineRule="auto"/>
-        <w:ind w:firstLine="567"/>
-        <w:jc w:val="both"/>
-        <w:rPr>
-          <w:color w:val="000000"/>
-        </w:rPr>
-      </w:pPr>
-      <w:r>
-        <w:rPr>
-          <w:color w:val="000000"/>
-        </w:rPr>
-        <w:t>-</w:t>
-      </w:r>
-      <w:r>
-        <w:rPr>
-          <w:color w:val="000000"/>
-        </w:rPr>
-        <w:t xml:space="preserve">  Tính tình vui vẻ, hòa đồng, luôn giúp đỡ mọi người.</w:t>
-      </w:r>
-    </w:p>
-    <w:p>
-      <w:pPr>
-        <w:spacing w:after="120" w:line="312" w:lineRule="auto"/>
-        <w:ind w:firstLine="567"/>
-        <w:jc w:val="both"/>
-        <w:rPr>
-          <w:color w:val="000000"/>
-        </w:rPr>
-      </w:pPr>
-      <w:r>
-        <w:rPr>
-          <w:color w:val="000000"/>
-        </w:rPr>
-        <w:t>-</w:t>
-      </w:r>
-      <w:r>
-        <w:rPr>
-          <w:color w:val="000000"/>
-        </w:rPr>
-        <w:t xml:space="preserve">  Luôn có thái độ cầu thị trong việc nhìn nhận, sửa chữa, khắc phục khuyết điểm.</w:t>
-      </w:r>
-    </w:p>
-    <w:p>
-      <w:pPr>
-        <w:spacing w:after="120" w:line="312" w:lineRule="auto"/>
-        <w:ind w:firstLine="567"/>
-        <w:jc w:val="both"/>
-        <w:rPr>
           <w:b/>
           <w:color w:val="000000"/>
         </w:rPr>
       </w:pPr>
       <w:r>
-        <w:rPr>
-          <w:b/>
-          <w:color w:val="000000"/>
-        </w:rPr>
-        <w:t>2. Khuyết điểm</w:t>
-      </w:r>
-      <w:r>
-        <w:rPr>
-          <w:b/>
-          <w:color w:val="000000"/>
-        </w:rPr>
-        <w:t>:</w:t>
-      </w:r>
-    </w:p>
-    <w:p>
-      <w:pPr>
-        <w:spacing w:after="120" w:line="312" w:lineRule="auto"/>
-        <w:ind w:firstLine="567"/>
-        <w:jc w:val="both"/>
-        <w:rPr>
-          <w:color w:val="000000"/>
-        </w:rPr>
-      </w:pPr>
-      <w:r>
-        <w:rPr>
-          <w:color w:val="000000"/>
-        </w:rPr>
-        <w:lastRenderedPageBreak/>
-        <w:t xml:space="preserve">- </w:t>
-      </w:r>
-      <w:r>
-        <w:rPr>
-          <w:color w:val="000000"/>
-        </w:rPr>
-        <w:t>Không có khuyết điểm gì lớn</w:t>
+        <w:t>2. Khuyết điểm: {{khuyet_diem}}</w:t>
       </w:r>
     </w:p>
     <w:bookmarkEnd w:id="0"/>

</xml_diff>

<commit_message>
Fix Mẫu 11, 12, 13 export handlers and UI
</commit_message>
<xml_diff>
--- a/public/2. Nghị quyết Đoàn Trường (02 bản).docx
+++ b/public/2. Nghị quyết Đoàn Trường (02 bản).docx
@@ -162,7 +162,10 @@
               <w:jc w:val="center"/>
             </w:pPr>
             <w:r>
-              <w:t>Số: {{so_nq_doan_truong}}</w:t>
+              <w:t xml:space="preserve">Số: </w:t>
+            </w:r>
+            <w:r>
+              <w:t xml:space="preserve">      NQ/ĐTN-ĐHKT</w:t>
             </w:r>
           </w:p>
         </w:tc>
@@ -178,7 +181,19 @@
               </w:rPr>
             </w:pPr>
             <w:r>
-              <w:t xml:space="preserve">Đà Nẵng, ngày {{ngay_ky_d}} tháng {{ngay_ky_m}} năm {{ngay_ky_y}}    </w:t>
+              <w:t xml:space="preserve">Đà Nẵng, ngày </w:t>
+            </w:r>
+            <w:r>
+              <w:t xml:space="preserve">    </w:t>
+            </w:r>
+            <w:r>
+              <w:t xml:space="preserve"> tháng </w:t>
+            </w:r>
+            <w:r>
+              <w:t xml:space="preserve">    </w:t>
+            </w:r>
+            <w:r>
+              <w:t xml:space="preserve"> năm {{ngay_ky_y}}</w:t>
             </w:r>
           </w:p>
         </w:tc>
@@ -295,12 +310,14 @@
               <w:rPr>
                 <w:b/>
                 <w:color w:val="000000"/>
+                <w:lang w:val="it-IT"/>
               </w:rPr>
             </w:pPr>
             <w:r>
               <w:rPr>
                 <w:b/>
                 <w:color w:val="000000"/>
+                <w:lang w:val="it-IT"/>
               </w:rPr>
               <w:t>- Chi ủy Chi bộ Sinh viên;</w:t>
             </w:r>
@@ -311,12 +328,14 @@
               <w:rPr>
                 <w:b/>
                 <w:color w:val="000000"/>
+                <w:lang w:val="it-IT"/>
               </w:rPr>
             </w:pPr>
             <w:r>
               <w:rPr>
                 <w:b/>
                 <w:color w:val="000000"/>
+                <w:lang w:val="it-IT"/>
               </w:rPr>
               <w:t xml:space="preserve">- </w:t>
             </w:r>
@@ -324,6 +343,7 @@
               <w:rPr>
                 <w:b/>
                 <w:color w:val="000000"/>
+                <w:lang w:val="it-IT"/>
               </w:rPr>
               <w:t>Đảng ủy Trường Đại học Kinh tế</w:t>
             </w:r>
@@ -331,6 +351,7 @@
               <w:rPr>
                 <w:b/>
                 <w:color w:val="000000"/>
+                <w:lang w:val="it-IT"/>
               </w:rPr>
               <w:t xml:space="preserve"> - Đại học Đà Nẵng</w:t>
             </w:r>
@@ -338,6 +359,7 @@
               <w:rPr>
                 <w:b/>
                 <w:color w:val="000000"/>
+                <w:lang w:val="it-IT"/>
               </w:rPr>
               <w:t>.</w:t>
             </w:r>
@@ -351,6 +373,7 @@
         <w:jc w:val="both"/>
         <w:rPr>
           <w:color w:val="000000"/>
+          <w:lang w:val="it-IT"/>
         </w:rPr>
       </w:pPr>
     </w:p>
@@ -359,11 +382,20 @@
         <w:spacing w:after="120" w:line="312" w:lineRule="auto"/>
         <w:ind w:firstLine="567"/>
         <w:jc w:val="both"/>
-      </w:pPr>
-      <w:r>
+        <w:rPr>
+          <w:lang w:val="it-IT"/>
+        </w:rPr>
+      </w:pPr>
+      <w:r>
+        <w:rPr>
+          <w:lang w:val="it-IT"/>
+        </w:rPr>
         <w:t xml:space="preserve">- Căn cứ điểm </w:t>
       </w:r>
       <w:r>
+        <w:rPr>
+          <w:lang w:val="it-IT"/>
+        </w:rPr>
         <w:t>5, Điều lệ Đảng Cộng sản Việt Nam</w:t>
       </w:r>
     </w:p>
@@ -374,17 +406,20 @@
         <w:jc w:val="both"/>
         <w:rPr>
           <w:color w:val="000000"/>
-        </w:rPr>
-      </w:pPr>
-      <w:r>
-        <w:rPr>
-          <w:color w:val="000000"/>
+          <w:lang w:val="it-IT"/>
+        </w:rPr>
+      </w:pPr>
+      <w:r>
+        <w:rPr>
+          <w:color w:val="000000"/>
+          <w:lang w:val="it-IT"/>
         </w:rPr>
         <w:t>- Xét biên bản họp của lớp</w:t>
       </w:r>
       <w:r>
         <w:rPr>
           <w:color w:val="000000"/>
+          <w:lang w:val="it-IT"/>
         </w:rPr>
         <w:t xml:space="preserve"> {{lop}}</w:t>
       </w:r>
@@ -396,23 +431,20 @@
         <w:jc w:val="both"/>
         <w:rPr>
           <w:color w:val="000000"/>
-        </w:rPr>
-      </w:pPr>
-      <w:r>
-        <w:rPr>
-          <w:color w:val="000000"/>
-        </w:rPr>
-        <w:t>- Xét nghị quyết, biên bản họp</w:t>
-      </w:r>
-      <w:r>
-        <w:rPr>
-          <w:color w:val="000000"/>
-        </w:rPr>
-        <w:t xml:space="preserve"> của Chi Đoàn </w:t>
-      </w:r>
-      <w:r>
-        <w:rPr>
-          <w:color w:val="000000"/>
+          <w:lang w:val="it-IT"/>
+        </w:rPr>
+      </w:pPr>
+      <w:r>
+        <w:rPr>
+          <w:color w:val="000000"/>
+          <w:lang w:val="it-IT"/>
+        </w:rPr>
+        <w:t xml:space="preserve">- Xét nghị quyết, biên bản họp của Chi Đoàn </w:t>
+      </w:r>
+      <w:r>
+        <w:rPr>
+          <w:color w:val="000000"/>
+          <w:lang w:val="it-IT"/>
         </w:rPr>
         <w:t>{{lop}}</w:t>
       </w:r>
@@ -424,17 +456,20 @@
         <w:jc w:val="both"/>
         <w:rPr>
           <w:color w:val="000000"/>
-        </w:rPr>
-      </w:pPr>
-      <w:r>
-        <w:rPr>
-          <w:color w:val="000000"/>
+          <w:lang w:val="it-IT"/>
+        </w:rPr>
+      </w:pPr>
+      <w:r>
+        <w:rPr>
+          <w:color w:val="000000"/>
+          <w:lang w:val="it-IT"/>
         </w:rPr>
         <w:t xml:space="preserve">- Xét nghị quyết, biên bản họp của Liên chi Đoàn </w:t>
       </w:r>
       <w:r>
         <w:rPr>
           <w:color w:val="000000"/>
+          <w:lang w:val="it-IT"/>
         </w:rPr>
         <w:t>khoa {{khoa}}</w:t>
       </w:r>
@@ -446,10 +481,38 @@
         <w:jc w:val="both"/>
         <w:rPr>
           <w:color w:val="000000"/>
-        </w:rPr>
-      </w:pPr>
-      <w:r>
-        <w:t>Ban Chấp hành Đoàn TNCS Hồ Chí Minh Trường Đại học Kinh tế - Đại học Đà Nẵng họp ngày {{ngay_hop_doan_truong_d}} tháng {{ngay_hop_doan_truong_m}} năm {{ngay_hop_doan_truong_y}} xét thấy:</w:t>
+          <w:lang w:val="it-IT"/>
+        </w:rPr>
+      </w:pPr>
+      <w:r>
+        <w:rPr>
+          <w:lang w:val="it-IT"/>
+        </w:rPr>
+        <w:t xml:space="preserve">Ban Chấp hành Đoàn TNCS Hồ Chí Minh Trường Đại học Kinh tế - Đại học Đà Nẵng họp ngày </w:t>
+      </w:r>
+      <w:r>
+        <w:rPr>
+          <w:lang w:val="it-IT"/>
+        </w:rPr>
+        <w:t xml:space="preserve">     </w:t>
+      </w:r>
+      <w:r>
+        <w:rPr>
+          <w:lang w:val="it-IT"/>
+        </w:rPr>
+        <w:t xml:space="preserve">tháng </w:t>
+      </w:r>
+      <w:r>
+        <w:rPr>
+          <w:lang w:val="it-IT"/>
+        </w:rPr>
+        <w:t xml:space="preserve">    </w:t>
+      </w:r>
+      <w:r>
+        <w:rPr>
+          <w:lang w:val="it-IT"/>
+        </w:rPr>
+        <w:t>năm {{ngay_hop_doan_truong_y}} xét thấy:</w:t>
       </w:r>
     </w:p>
     <w:p>
@@ -459,9 +522,13 @@
         <w:jc w:val="both"/>
         <w:rPr>
           <w:color w:val="000000"/>
-        </w:rPr>
-      </w:pPr>
-      <w:r>
+          <w:lang w:val="it-IT"/>
+        </w:rPr>
+      </w:pPr>
+      <w:r>
+        <w:rPr>
+          <w:lang w:val="it-IT"/>
+        </w:rPr>
         <w:t>Đảng viên dự bị {{ho_ten}} được kết nạp vào Đảng ngày {{ngay_vao_dang_formatted}}, đã nỗ lực, phấn đấu trở thành đảng viên chính thức, nay Ban Chấp hành Đoàn Trường Đại học Kinh tế kính báo cáo tổ chức Đảng các cấp về những ưu điểm, khuyết điểm chính của đoàn viên {{ho_ten}} trong suốt thời gian dự bị, cụ thể như sau:</w:t>
       </w:r>
     </w:p>
@@ -472,11 +539,17 @@
         <w:jc w:val="both"/>
         <w:rPr>
           <w:b/>
-          <w:color w:val="000000"/>
-        </w:rPr>
-      </w:pPr>
-      <w:r>
-        <w:t>1. Ưu điểm: {{uu_diem}}</w:t>
+          <w:bCs/>
+          <w:lang w:val="it-IT"/>
+        </w:rPr>
+      </w:pPr>
+      <w:r>
+        <w:rPr>
+          <w:b/>
+          <w:bCs/>
+          <w:lang w:val="it-IT"/>
+        </w:rPr>
+        <w:t xml:space="preserve">1. Ưu điểm: </w:t>
       </w:r>
     </w:p>
     <w:p>
@@ -485,131 +558,30 @@
         <w:ind w:firstLine="567"/>
         <w:jc w:val="both"/>
         <w:rPr>
-          <w:b/>
-          <w:color w:val="000000"/>
-        </w:rPr>
-      </w:pPr>
-      <w:r>
-        <w:t>2. Khuyết điểm: {{khuyet_diem}}</w:t>
-      </w:r>
-    </w:p>
-    <w:bookmarkEnd w:id="0"/>
+          <w:lang w:val="it-IT"/>
+        </w:rPr>
+      </w:pPr>
+      <w:r>
+        <w:rPr>
+          <w:lang w:val="it-IT"/>
+        </w:rPr>
+        <w:t>- Có phẩm chất chính trị tốt lập trường tư tưởng vững vàng, tuyệt đối trung thành với đường lối của Đảng, tác phong đứng đắn, mẫu mực.</w:t>
+      </w:r>
+    </w:p>
     <w:p>
       <w:pPr>
         <w:spacing w:after="120" w:line="312" w:lineRule="auto"/>
         <w:ind w:firstLine="567"/>
         <w:jc w:val="both"/>
         <w:rPr>
-          <w:color w:val="000000"/>
-        </w:rPr>
-      </w:pPr>
-      <w:r>
-        <w:rPr>
-          <w:color w:val="000000"/>
-        </w:rPr>
-        <w:t xml:space="preserve">Đối chiếu </w:t>
-      </w:r>
-      <w:r>
-        <w:rPr>
-          <w:color w:val="000000"/>
-        </w:rPr>
-        <w:t xml:space="preserve">với tiêu chuẩn và điều kiện chuyển </w:t>
-      </w:r>
-      <w:r>
-        <w:rPr>
-          <w:color w:val="000000"/>
-        </w:rPr>
-        <w:t xml:space="preserve">đảng </w:t>
-      </w:r>
-      <w:r>
-        <w:rPr>
-          <w:color w:val="000000"/>
-        </w:rPr>
-        <w:t>chính thức</w:t>
-      </w:r>
-      <w:r>
-        <w:rPr>
-          <w:color w:val="000000"/>
-        </w:rPr>
-        <w:t xml:space="preserve">, </w:t>
-      </w:r>
-      <w:r>
-        <w:rPr>
-          <w:color w:val="000000"/>
-        </w:rPr>
-        <w:t>Ban Chấp hành Đoàn Trường Đại học Kinh tế</w:t>
-      </w:r>
-      <w:r>
-        <w:rPr>
-          <w:color w:val="000000"/>
-        </w:rPr>
-        <w:t xml:space="preserve"> giới thiệu và</w:t>
-      </w:r>
-      <w:r>
-        <w:rPr>
-          <w:color w:val="000000"/>
-        </w:rPr>
-        <w:t xml:space="preserve"> kính</w:t>
-      </w:r>
-      <w:r>
-        <w:rPr>
-          <w:color w:val="000000"/>
-        </w:rPr>
-        <w:t xml:space="preserve"> đề nghị</w:t>
-      </w:r>
-      <w:r>
-        <w:rPr>
-          <w:color w:val="000000"/>
-        </w:rPr>
-        <w:t xml:space="preserve"> Chi ủy</w:t>
-      </w:r>
-      <w:r>
-        <w:rPr>
-          <w:color w:val="000000"/>
-        </w:rPr>
-        <w:t xml:space="preserve"> Chi bộ</w:t>
-      </w:r>
-      <w:r>
-        <w:rPr>
-          <w:color w:val="000000"/>
-        </w:rPr>
-        <w:t xml:space="preserve"> Sinh viên</w:t>
-      </w:r>
-      <w:r>
-        <w:rPr>
-          <w:color w:val="000000"/>
-        </w:rPr>
-        <w:t>, Đảng uỷ</w:t>
-      </w:r>
-      <w:r>
-        <w:rPr>
-          <w:color w:val="000000"/>
-        </w:rPr>
-        <w:t xml:space="preserve"> Trường Đại học Kinh tế</w:t>
-      </w:r>
-      <w:r>
-        <w:rPr>
-          <w:color w:val="000000"/>
-        </w:rPr>
-        <w:t xml:space="preserve"> xem xét, công nhận đảng viên dự bị </w:t>
-      </w:r>
-      <w:r>
-        <w:rPr>
-          <w:color w:val="000000"/>
-        </w:rPr>
-        <w:t>{{ho_ten}}</w:t>
-      </w:r>
-      <w:r>
-        <w:rPr>
-          <w:color w:val="000000"/>
-        </w:rPr>
-        <w:t xml:space="preserve"> trở thành đảng viên chính thức</w:t>
-      </w:r>
-      <w:r>
-        <w:rPr>
-          <w:color w:val="000000"/>
-        </w:rPr>
-        <w:t>.</w:t>
+          <w:lang w:val="it-IT"/>
+        </w:rPr>
+      </w:pPr>
+      <w:r>
+        <w:rPr>
+          <w:lang w:val="it-IT"/>
+        </w:rPr>
+        <w:t>- Có lối sống đạo đức trong sáng, giản dị, luôn có ý thức tu dưỡng và rèn luyện đạo đức, luôn là tấm gương sáng cho các thế hệ noi theo.</w:t>
       </w:r>
     </w:p>
     <w:p>
@@ -618,11 +590,14 @@
         <w:ind w:firstLine="567"/>
         <w:jc w:val="both"/>
         <w:rPr>
-          <w:color w:val="000000"/>
-        </w:rPr>
-      </w:pPr>
-      <w:r>
-        <w:t>Biểu quyết thông qua với sự tán thành của {{tan_thanh_doan_truong}} đồng chí Ủy viên Ban Chấp hành Đoàn Trường (đạt {{ti_le_doan_truong}}%); số không tán thành {{khong_tan_thanh_doan_truong}} đồng chí.</w:t>
+          <w:lang w:val="it-IT"/>
+        </w:rPr>
+      </w:pPr>
+      <w:r>
+        <w:rPr>
+          <w:lang w:val="it-IT"/>
+        </w:rPr>
+        <w:t>- Có năng lực công tác tốt, luôn tích cực tham gia các hoạt động của chi Đoàn, khoa, Đoàn trường.</w:t>
       </w:r>
     </w:p>
     <w:p>
@@ -631,28 +606,259 @@
         <w:ind w:firstLine="567"/>
         <w:jc w:val="both"/>
         <w:rPr>
-          <w:color w:val="000000"/>
-        </w:rPr>
-      </w:pPr>
-      <w:r>
-        <w:rPr>
-          <w:color w:val="000000"/>
-        </w:rPr>
-        <w:t>Ban Chấp hành Đoàn Trường Đại học Kinh tế xin hoàn toàn chịu trách nhiệm về những nội dung giới thiệu nói trên</w:t>
-      </w:r>
-      <w:r>
-        <w:rPr>
-          <w:color w:val="000000"/>
-        </w:rPr>
-        <w:t>./.</w:t>
-      </w:r>
-    </w:p>
-    <w:p>
-      <w:pPr>
+          <w:lang w:val="it-IT"/>
+        </w:rPr>
+      </w:pPr>
+      <w:r>
+        <w:rPr>
+          <w:lang w:val="it-IT"/>
+        </w:rPr>
+        <w:t>- Tính tình vui vẻ, hòa đồng, luôn giúp đỡ mọi người.</w:t>
+      </w:r>
+    </w:p>
+    <w:p>
+      <w:pPr>
+        <w:spacing w:after="120" w:line="312" w:lineRule="auto"/>
         <w:ind w:firstLine="567"/>
         <w:jc w:val="both"/>
         <w:rPr>
-          <w:color w:val="000000"/>
+          <w:lang w:val="it-IT"/>
+        </w:rPr>
+      </w:pPr>
+      <w:r>
+        <w:rPr>
+          <w:lang w:val="it-IT"/>
+        </w:rPr>
+        <w:t>- Luôn có thái độ cầu thị trong việc nhìn nhận, sửa chữa, khắc phục khuyết điểm của bản thân.</w:t>
+      </w:r>
+    </w:p>
+    <w:p>
+      <w:pPr>
+        <w:spacing w:after="120" w:line="312" w:lineRule="auto"/>
+        <w:ind w:firstLine="567"/>
+        <w:jc w:val="both"/>
+        <w:rPr>
+          <w:lang w:val="it-IT"/>
+        </w:rPr>
+      </w:pPr>
+      <w:r>
+        <w:rPr>
+          <w:b/>
+          <w:bCs/>
+          <w:lang w:val="it-IT"/>
+        </w:rPr>
+        <w:lastRenderedPageBreak/>
+        <w:t>2. Khuyết điểm:</w:t>
+      </w:r>
+      <w:r>
+        <w:rPr>
+          <w:lang w:val="it-IT"/>
+        </w:rPr>
+        <w:t xml:space="preserve"> </w:t>
+      </w:r>
+    </w:p>
+    <w:p>
+      <w:pPr>
+        <w:spacing w:after="120" w:line="312" w:lineRule="auto"/>
+        <w:ind w:firstLine="567"/>
+        <w:jc w:val="both"/>
+        <w:rPr>
+          <w:lang w:val="it-IT"/>
+        </w:rPr>
+      </w:pPr>
+      <w:r>
+        <w:rPr>
+          <w:lang w:val="it-IT"/>
+        </w:rPr>
+        <w:t>- Không có khuyết điểm gì lớn.</w:t>
+      </w:r>
+    </w:p>
+    <w:p>
+      <w:pPr>
+        <w:spacing w:after="120" w:line="312" w:lineRule="auto"/>
+        <w:ind w:firstLine="567"/>
+        <w:jc w:val="both"/>
+        <w:rPr>
+          <w:color w:val="000000"/>
+          <w:lang w:val="it-IT"/>
+        </w:rPr>
+      </w:pPr>
+      <w:r>
+        <w:rPr>
+          <w:color w:val="000000"/>
+          <w:lang w:val="it-IT"/>
+        </w:rPr>
+        <w:t xml:space="preserve">Đối chiếu </w:t>
+      </w:r>
+      <w:r>
+        <w:rPr>
+          <w:color w:val="000000"/>
+          <w:lang w:val="it-IT"/>
+        </w:rPr>
+        <w:t xml:space="preserve">với tiêu chuẩn và điều kiện chuyển </w:t>
+      </w:r>
+      <w:r>
+        <w:rPr>
+          <w:color w:val="000000"/>
+          <w:lang w:val="it-IT"/>
+        </w:rPr>
+        <w:t xml:space="preserve">đảng </w:t>
+      </w:r>
+      <w:r>
+        <w:rPr>
+          <w:color w:val="000000"/>
+          <w:lang w:val="it-IT"/>
+        </w:rPr>
+        <w:t>chính thức</w:t>
+      </w:r>
+      <w:r>
+        <w:rPr>
+          <w:color w:val="000000"/>
+          <w:lang w:val="it-IT"/>
+        </w:rPr>
+        <w:t xml:space="preserve">, </w:t>
+      </w:r>
+      <w:r>
+        <w:rPr>
+          <w:color w:val="000000"/>
+          <w:lang w:val="it-IT"/>
+        </w:rPr>
+        <w:t>Ban Chấp hành Đoàn Trường Đại học Kinh tế</w:t>
+      </w:r>
+      <w:r>
+        <w:rPr>
+          <w:color w:val="000000"/>
+          <w:lang w:val="it-IT"/>
+        </w:rPr>
+        <w:t xml:space="preserve"> giới thiệu và</w:t>
+      </w:r>
+      <w:r>
+        <w:rPr>
+          <w:color w:val="000000"/>
+          <w:lang w:val="it-IT"/>
+        </w:rPr>
+        <w:t xml:space="preserve"> kính</w:t>
+      </w:r>
+      <w:r>
+        <w:rPr>
+          <w:color w:val="000000"/>
+          <w:lang w:val="it-IT"/>
+        </w:rPr>
+        <w:t xml:space="preserve"> đề nghị</w:t>
+      </w:r>
+      <w:r>
+        <w:rPr>
+          <w:color w:val="000000"/>
+          <w:lang w:val="it-IT"/>
+        </w:rPr>
+        <w:t xml:space="preserve"> Chi ủy</w:t>
+      </w:r>
+      <w:r>
+        <w:rPr>
+          <w:color w:val="000000"/>
+          <w:lang w:val="it-IT"/>
+        </w:rPr>
+        <w:t xml:space="preserve"> Chi bộ</w:t>
+      </w:r>
+      <w:r>
+        <w:rPr>
+          <w:color w:val="000000"/>
+          <w:lang w:val="it-IT"/>
+        </w:rPr>
+        <w:t xml:space="preserve"> Sinh viên</w:t>
+      </w:r>
+      <w:r>
+        <w:rPr>
+          <w:color w:val="000000"/>
+          <w:lang w:val="it-IT"/>
+        </w:rPr>
+        <w:t>, Đảng uỷ</w:t>
+      </w:r>
+      <w:r>
+        <w:rPr>
+          <w:color w:val="000000"/>
+          <w:lang w:val="it-IT"/>
+        </w:rPr>
+        <w:t xml:space="preserve"> Trường Đại học Kinh tế</w:t>
+      </w:r>
+      <w:r>
+        <w:rPr>
+          <w:color w:val="000000"/>
+          <w:lang w:val="it-IT"/>
+        </w:rPr>
+        <w:t xml:space="preserve"> xem xét, công nhận đảng viên dự bị </w:t>
+      </w:r>
+      <w:r>
+        <w:rPr>
+          <w:color w:val="000000"/>
+          <w:lang w:val="it-IT"/>
+        </w:rPr>
+        <w:t>{{ho_ten}}</w:t>
+      </w:r>
+      <w:r>
+        <w:rPr>
+          <w:color w:val="000000"/>
+          <w:lang w:val="it-IT"/>
+        </w:rPr>
+        <w:t xml:space="preserve"> trở thành đảng viên chính thức</w:t>
+      </w:r>
+      <w:r>
+        <w:rPr>
+          <w:color w:val="000000"/>
+          <w:lang w:val="it-IT"/>
+        </w:rPr>
+        <w:t>.</w:t>
+      </w:r>
+    </w:p>
+    <w:p>
+      <w:pPr>
+        <w:spacing w:after="120" w:line="312" w:lineRule="auto"/>
+        <w:ind w:firstLine="567"/>
+        <w:jc w:val="both"/>
+        <w:rPr>
+          <w:color w:val="000000"/>
+          <w:lang w:val="it-IT"/>
+        </w:rPr>
+      </w:pPr>
+      <w:r>
+        <w:rPr>
+          <w:lang w:val="it-IT"/>
+        </w:rPr>
+        <w:t>Biểu quyết thông qua với sự tán thành của {{tan_thanh_doan_truong}} đồng chí Ủy viên Ban Chấp hành Đoàn Trường (đạt {{ti_le_doan_truong}}%); số không tán thành {{khong_tan_thanh_doan_truong}} đồng chí.</w:t>
+      </w:r>
+    </w:p>
+    <w:p>
+      <w:pPr>
+        <w:spacing w:after="120" w:line="312" w:lineRule="auto"/>
+        <w:ind w:firstLine="567"/>
+        <w:jc w:val="both"/>
+        <w:rPr>
+          <w:color w:val="000000"/>
+          <w:lang w:val="it-IT"/>
+        </w:rPr>
+      </w:pPr>
+      <w:r>
+        <w:rPr>
+          <w:color w:val="000000"/>
+          <w:lang w:val="it-IT"/>
+        </w:rPr>
+        <w:t>Ban Chấp hành Đoàn Trường Đại học Kinh tế xin hoàn toàn chịu trách nhiệm về những nội dung giới thiệu nói trên</w:t>
+      </w:r>
+      <w:r>
+        <w:rPr>
+          <w:color w:val="000000"/>
+          <w:lang w:val="it-IT"/>
+        </w:rPr>
+        <w:t>./.</w:t>
+      </w:r>
+    </w:p>
+    <w:p>
+      <w:pPr>
+        <w:ind w:firstLine="567"/>
+        <w:jc w:val="both"/>
+        <w:rPr>
+          <w:color w:val="000000"/>
+          <w:lang w:val="it-IT"/>
         </w:rPr>
       </w:pPr>
     </w:p>
@@ -679,6 +885,7 @@
               <w:jc w:val="both"/>
               <w:rPr>
                 <w:rFonts w:eastAsia="Calibri"/>
+                <w:lang w:val="it-IT"/>
               </w:rPr>
             </w:pPr>
           </w:p>
@@ -691,6 +898,7 @@
                 <w:b/>
                 <w:sz w:val="26"/>
                 <w:szCs w:val="26"/>
+                <w:lang w:val="it-IT"/>
               </w:rPr>
             </w:pPr>
             <w:r>
@@ -699,6 +907,7 @@
                 <w:b/>
                 <w:sz w:val="26"/>
                 <w:szCs w:val="26"/>
+                <w:lang w:val="it-IT"/>
               </w:rPr>
               <w:t>Nơi nhận:</w:t>
             </w:r>
@@ -711,6 +920,7 @@
                 <w:rFonts w:eastAsia="Calibri"/>
                 <w:sz w:val="22"/>
                 <w:szCs w:val="24"/>
+                <w:lang w:val="it-IT"/>
               </w:rPr>
             </w:pPr>
             <w:r>
@@ -718,6 +928,7 @@
                 <w:rFonts w:eastAsia="Calibri"/>
                 <w:sz w:val="22"/>
                 <w:szCs w:val="24"/>
+                <w:lang w:val="it-IT"/>
               </w:rPr>
               <w:t xml:space="preserve">- </w:t>
             </w:r>
@@ -726,6 +937,7 @@
                 <w:rFonts w:eastAsia="Calibri"/>
                 <w:sz w:val="22"/>
                 <w:szCs w:val="24"/>
+                <w:lang w:val="it-IT"/>
               </w:rPr>
               <w:t>Như trên</w:t>
             </w:r>
@@ -734,6 +946,7 @@
                 <w:rFonts w:eastAsia="Calibri"/>
                 <w:sz w:val="22"/>
                 <w:szCs w:val="24"/>
+                <w:lang w:val="it-IT"/>
               </w:rPr>
               <w:t>;</w:t>
             </w:r>
@@ -744,6 +957,7 @@
               <w:jc w:val="both"/>
               <w:rPr>
                 <w:rFonts w:eastAsia="Calibri"/>
+                <w:lang w:val="it-IT"/>
               </w:rPr>
             </w:pPr>
             <w:r>
@@ -751,6 +965,7 @@
                 <w:rFonts w:eastAsia="Calibri"/>
                 <w:sz w:val="22"/>
                 <w:szCs w:val="24"/>
+                <w:lang w:val="it-IT"/>
               </w:rPr>
               <w:t>- Lưu</w:t>
             </w:r>
@@ -759,6 +974,7 @@
                 <w:rFonts w:eastAsia="Calibri"/>
                 <w:sz w:val="22"/>
                 <w:szCs w:val="24"/>
+                <w:lang w:val="it-IT"/>
               </w:rPr>
               <w:t>:</w:t>
             </w:r>
@@ -767,6 +983,7 @@
                 <w:rFonts w:eastAsia="Calibri"/>
                 <w:sz w:val="22"/>
                 <w:szCs w:val="24"/>
+                <w:lang w:val="it-IT"/>
               </w:rPr>
               <w:t xml:space="preserve"> VP.</w:t>
             </w:r>
@@ -782,28 +999,16 @@
               <w:rPr>
                 <w:rFonts w:eastAsia="Calibri"/>
                 <w:b/>
+                <w:lang w:val="it-IT"/>
               </w:rPr>
             </w:pPr>
             <w:r>
               <w:rPr>
                 <w:rFonts w:eastAsia="Calibri"/>
                 <w:b/>
-              </w:rPr>
-              <w:t xml:space="preserve">TM. BAN </w:t>
-            </w:r>
-            <w:r>
-              <w:rPr>
-                <w:rFonts w:eastAsia="Calibri"/>
-                <w:b/>
-              </w:rPr>
-              <w:t>CHẤP HÀNH</w:t>
-            </w:r>
-            <w:r>
-              <w:rPr>
-                <w:rFonts w:eastAsia="Calibri"/>
-                <w:b/>
-              </w:rPr>
-              <w:t xml:space="preserve"> ĐOÀN TRƯỜNG</w:t>
+                <w:lang w:val="it-IT"/>
+              </w:rPr>
+              <w:t>TM. BAN CHẤP HÀNH ĐOÀN TRƯỜNG</w:t>
             </w:r>
           </w:p>
           <w:p>
@@ -811,11 +1016,13 @@
               <w:jc w:val="center"/>
               <w:rPr>
                 <w:rFonts w:eastAsia="Calibri"/>
+                <w:lang w:val="it-IT"/>
               </w:rPr>
             </w:pPr>
             <w:r>
               <w:rPr>
                 <w:rFonts w:eastAsia="Calibri"/>
+                <w:lang w:val="it-IT"/>
               </w:rPr>
               <w:t>BÍ THƯ</w:t>
             </w:r>
@@ -824,6 +1031,7 @@
             <w:pPr>
               <w:rPr>
                 <w:rFonts w:eastAsia="Calibri"/>
+                <w:lang w:val="it-IT"/>
               </w:rPr>
             </w:pPr>
           </w:p>
@@ -832,6 +1040,7 @@
               <w:jc w:val="center"/>
               <w:rPr>
                 <w:rFonts w:eastAsia="Calibri"/>
+                <w:lang w:val="it-IT"/>
               </w:rPr>
             </w:pPr>
           </w:p>
@@ -840,6 +1049,7 @@
               <w:jc w:val="center"/>
               <w:rPr>
                 <w:rFonts w:eastAsia="Calibri"/>
+                <w:lang w:val="it-IT"/>
               </w:rPr>
             </w:pPr>
           </w:p>
@@ -848,15 +1058,9 @@
               <w:jc w:val="center"/>
               <w:rPr>
                 <w:rFonts w:eastAsia="Calibri"/>
+                <w:lang w:val="it-IT"/>
               </w:rPr>
             </w:pPr>
-            <w:r>
-              <w:rPr>
-                <w:b/>
-                <w:rFonts w:eastAsia="Calibri"/>
-              </w:rPr>
-              <w:t>{{bi_thu_doan_truong}}</w:t>
-            </w:r>
           </w:p>
           <w:p>
             <w:pPr>
@@ -865,6 +1069,7 @@
                 <w:rFonts w:eastAsia="Calibri"/>
                 <w:b/>
                 <w:bCs/>
+                <w:lang w:val="it-IT"/>
               </w:rPr>
             </w:pPr>
           </w:p>
@@ -874,6 +1079,9 @@
     <w:p>
       <w:pPr>
         <w:spacing w:line="276" w:lineRule="auto"/>
+        <w:rPr>
+          <w:lang w:val="it-IT"/>
+        </w:rPr>
       </w:pPr>
     </w:p>
     <w:sectPr>

</xml_diff>